<commit_message>
feat(contracts): add live preview, drafts and targeted emphasis
</commit_message>
<xml_diff>
--- a/assets/templates/contrato-motive-v1.docx
+++ b/assets/templates/contrato-motive-v1.docx
@@ -788,7 +788,7 @@
       <w:r>
         <w:rPr>
           <w:noProof/>
-          <w:color w:val="002060"/>
+          <w:color w:val="000000"/>
         </w:rPr>
         <w:drawing>
           <wp:anchor distT="0" distB="0" distL="114300" distR="114300" simplePos="0" relativeHeight="251861040" behindDoc="0" locked="0" layoutInCell="1" allowOverlap="1" wp14:anchorId="2445EA74" wp14:editId="7CA308E1">
@@ -848,7 +848,7 @@
       <w:r>
         <w:rPr>
           <w:noProof/>
-          <w:color w:val="002060"/>
+          <w:color w:val="000000"/>
         </w:rPr>
         <w:t>{PARAGRAFO_VENDEDOR}</w:t>
       </w:r>
@@ -1136,13 +1136,13 @@
         <w:ind w:left="1134"/>
         <w:rPr>
           <w:noProof/>
-          <w:color w:val="002060"/>
+          <w:color w:val="000000"/>
         </w:rPr>
       </w:pPr>
       <w:r>
         <w:rPr>
           <w:noProof/>
-          <w:color w:val="002060"/>
+          <w:color w:val="000000"/>
         </w:rPr>
         <mc:AlternateContent>
           <mc:Choice Requires="wps">
@@ -1227,7 +1227,7 @@
       <w:r>
         <w:rPr>
           <w:noProof/>
-          <w:color w:val="002060"/>
+          <w:color w:val="000000"/>
         </w:rPr>
         <w:drawing>
           <wp:anchor distT="0" distB="0" distL="114300" distR="114300" simplePos="0" relativeHeight="251866160" behindDoc="0" locked="0" layoutInCell="1" allowOverlap="1" wp14:anchorId="073ADE58" wp14:editId="16C448CA">
@@ -1293,7 +1293,7 @@
       <w:r>
         <w:rPr>
           <w:noProof/>
-          <w:color w:val="002060"/>
+          <w:color w:val="000000"/>
         </w:rPr>
         <w:t>{PARAGRAFO_COMPRADOR}</w:t>
       </w:r>
@@ -2501,7 +2501,7 @@
       <w:r>
         <w:rPr>
           <w:b/>
-          <w:color w:val="002060"/>
+          <w:color w:val="000000"/>
         </w:rPr>
         <w:t>{VALOR_DO_IMOVEL}</w:t>
       </w:r>
@@ -2576,7 +2576,7 @@
         <w:rPr>
           <w:b w:val="0"/>
           <w:bCs w:val="0"/>
-          <w:color w:val="002060"/>
+          <w:color w:val="000000"/>
         </w:rPr>
         <w:t>{VALOR_SINAL}</w:t>
       </w:r>
@@ -2584,7 +2584,7 @@
         <w:rPr>
           <w:b w:val="0"/>
           <w:bCs w:val="0"/>
-          <w:color w:val="002060"/>
+          <w:color w:val="000000"/>
         </w:rPr>
         <w:t xml:space="preserve"> </w:t>
       </w:r>
@@ -2643,7 +2643,7 @@
         <w:rPr>
           <w:b w:val="0"/>
           <w:bCs w:val="0"/>
-          <w:color w:val="002060"/>
+          <w:color w:val="000000"/>
         </w:rPr>
         <w:t>{VALOR_FGTS}</w:t>
       </w:r>
@@ -2651,7 +2651,7 @@
         <w:rPr>
           <w:b w:val="0"/>
           <w:bCs w:val="0"/>
-          <w:color w:val="002060"/>
+          <w:color w:val="000000"/>
         </w:rPr>
         <w:t xml:space="preserve"> </w:t>
       </w:r>
@@ -2706,7 +2706,7 @@
         <w:rPr>
           <w:b w:val="0"/>
           <w:bCs w:val="0"/>
-          <w:color w:val="002060"/>
+          <w:color w:val="000000"/>
         </w:rPr>
         <w:t>{VALOR_RECURSOS}</w:t>
       </w:r>
@@ -2714,7 +2714,7 @@
         <w:rPr>
           <w:b w:val="0"/>
           <w:bCs w:val="0"/>
-          <w:color w:val="002060"/>
+          <w:color w:val="000000"/>
         </w:rPr>
         <w:t xml:space="preserve"> </w:t>
       </w:r>
@@ -2766,7 +2766,7 @@
         <w:rPr>
           <w:b w:val="0"/>
           <w:bCs w:val="0"/>
-          <w:color w:val="002060"/>
+          <w:color w:val="000000"/>
         </w:rPr>
         <w:t>{VALOR_FINANCIAMENTO}</w:t>
       </w:r>
@@ -2774,7 +2774,7 @@
         <w:rPr>
           <w:b w:val="0"/>
           <w:bCs w:val="0"/>
-          <w:color w:val="002060"/>
+          <w:color w:val="000000"/>
         </w:rPr>
         <w:t xml:space="preserve"> </w:t>
       </w:r>
@@ -2824,7 +2824,7 @@
         <w:rPr>
           <w:b w:val="0"/>
           <w:bCs w:val="0"/>
-          <w:color w:val="002060"/>
+          <w:color w:val="000000"/>
         </w:rPr>
         <w:t>{NOME_BANCO}</w:t>
       </w:r>
@@ -5666,7 +5666,7 @@
         <w:rPr>
           <w:b/>
           <w:bCs/>
-          <w:color w:val="02A5B4"/>
+          <w:color w:val="000000"/>
         </w:rPr>
         <w:sectPr>
           <w:type w:val="continuous"/>
@@ -5681,7 +5681,7 @@
         <w:rPr>
           <w:b/>
           <w:bCs/>
-          <w:color w:val="02A5B4"/>
+          <w:color w:val="000000"/>
         </w:rPr>
         <w:t>__________________________</w:t>
       </w:r>
@@ -5689,7 +5689,7 @@
         <w:rPr>
           <w:b/>
           <w:bCs/>
-          <w:color w:val="02A5B4"/>
+          <w:color w:val="000000"/>
         </w:rPr>
         <w:t xml:space="preserve">        </w:t>
       </w:r>
@@ -5709,32 +5709,32 @@
       </w:pPr>
       <w:r>
         <w:rPr>
-          <w:color w:val="002060"/>
+          <w:color w:val="000000"/>
         </w:rPr>
         <w:t>{NOME_VENDEDOR}</w:t>
       </w:r>
       <w:r>
         <w:rPr>
-          <w:color w:val="002060"/>
+          <w:color w:val="000000"/>
         </w:rPr>
         <w:tab/>
       </w:r>
       <w:r>
         <w:rPr>
-          <w:color w:val="002060"/>
+          <w:color w:val="000000"/>
         </w:rPr>
         <w:tab/>
         <w:t xml:space="preserve">     </w:t>
       </w:r>
       <w:r>
         <w:rPr>
-          <w:color w:val="002060"/>
+          <w:color w:val="000000"/>
         </w:rPr>
         <w:tab/>
       </w:r>
       <w:r>
         <w:rPr>
-          <w:color w:val="002060"/>
+          <w:color w:val="000000"/>
         </w:rPr>
         <w:t xml:space="preserve"> </w:t>
       </w:r>
@@ -5762,7 +5762,7 @@
         <w:rPr>
           <w:b/>
           <w:bCs/>
-          <w:color w:val="02A5B4"/>
+          <w:color w:val="000000"/>
         </w:rPr>
         <w:t>__________________________</w:t>
       </w:r>
@@ -5770,7 +5770,7 @@
         <w:rPr>
           <w:b/>
           <w:bCs/>
-          <w:color w:val="02A5B4"/>
+          <w:color w:val="000000"/>
         </w:rPr>
         <w:t xml:space="preserve">                        </w:t>
       </w:r>
@@ -5782,7 +5782,7 @@
       </w:r>
       <w:r>
         <w:rPr>
-          <w:color w:val="002060"/>
+          <w:color w:val="000000"/>
         </w:rPr>
         <w:t>{NOME_SEGUNDO_VENDEDOR}</w:t>
       </w:r>
@@ -5847,7 +5847,7 @@
         <w:rPr>
           <w:b/>
           <w:bCs/>
-          <w:color w:val="02A5B4"/>
+          <w:color w:val="000000"/>
         </w:rPr>
         <w:sectPr>
           <w:type w:val="continuous"/>
@@ -5862,7 +5862,7 @@
         <w:rPr>
           <w:b/>
           <w:bCs/>
-          <w:color w:val="02A5B4"/>
+          <w:color w:val="000000"/>
         </w:rPr>
         <w:t>__________________________</w:t>
       </w:r>
@@ -5870,7 +5870,7 @@
         <w:rPr>
           <w:b/>
           <w:bCs/>
-          <w:color w:val="02A5B4"/>
+          <w:color w:val="000000"/>
         </w:rPr>
         <w:t xml:space="preserve">            </w:t>
       </w:r>
@@ -5878,7 +5878,7 @@
         <w:rPr>
           <w:b/>
           <w:bCs/>
-          <w:color w:val="02A5B4"/>
+          <w:color w:val="000000"/>
         </w:rPr>
         <w:tab/>
         <w:t xml:space="preserve">                           </w:t>
@@ -5901,7 +5901,7 @@
       </w:pPr>
       <w:r>
         <w:rPr>
-          <w:color w:val="002060"/>
+          <w:color w:val="000000"/>
         </w:rPr>
         <w:t>{NOME_COMPRADOR}</w:t>
       </w:r>
@@ -5909,7 +5909,7 @@
         <w:rPr>
           <w:b/>
           <w:bCs/>
-          <w:color w:val="02A5B4"/>
+          <w:color w:val="000000"/>
         </w:rPr>
         <w:tab/>
       </w:r>
@@ -5917,7 +5917,7 @@
         <w:rPr>
           <w:b/>
           <w:bCs/>
-          <w:color w:val="02A5B4"/>
+          <w:color w:val="000000"/>
         </w:rPr>
         <w:tab/>
       </w:r>
@@ -5925,13 +5925,13 @@
         <w:rPr>
           <w:b/>
           <w:bCs/>
-          <w:color w:val="02A5B4"/>
+          <w:color w:val="000000"/>
         </w:rPr>
         <w:tab/>
       </w:r>
       <w:r>
         <w:rPr>
-          <w:color w:val="02A5B4"/>
+          <w:color w:val="000000"/>
         </w:rPr>
         <w:br/>
       </w:r>
@@ -5959,7 +5959,7 @@
         <w:rPr>
           <w:b/>
           <w:bCs/>
-          <w:color w:val="02A5B4"/>
+          <w:color w:val="000000"/>
         </w:rPr>
         <w:t>__________________________</w:t>
       </w:r>
@@ -5968,7 +5968,7 @@
       </w:r>
       <w:r>
         <w:rPr>
-          <w:color w:val="002060"/>
+          <w:color w:val="000000"/>
         </w:rPr>
         <w:t>{NOME_SEGUNDO_COMPRADOR}</w:t>
       </w:r>
@@ -6024,7 +6024,7 @@
         <w:rPr>
           <w:b/>
           <w:bCs/>
-          <w:color w:val="02A5B4"/>
+          <w:color w:val="000000"/>
         </w:rPr>
         <w:sectPr>
           <w:type w:val="continuous"/>
@@ -6039,7 +6039,7 @@
         <w:rPr>
           <w:b/>
           <w:bCs/>
-          <w:color w:val="02A5B4"/>
+          <w:color w:val="000000"/>
         </w:rPr>
         <w:t>__________________________</w:t>
       </w:r>
@@ -6047,7 +6047,7 @@
         <w:rPr>
           <w:b/>
           <w:bCs/>
-          <w:color w:val="02A5B4"/>
+          <w:color w:val="000000"/>
         </w:rPr>
         <w:t xml:space="preserve">                            </w:t>
       </w:r>
@@ -8054,7 +8054,7 @@
       </w:pPr>
       <w:rPr>
         <w:rFonts w:ascii="Wingdings" w:hAnsi="Wingdings" w:hint="default"/>
-        <w:color w:val="02A5B4"/>
+        <w:color w:val="000000"/>
       </w:rPr>
     </w:lvl>
     <w:lvl w:ilvl="1" w:tplc="04160003">
@@ -8259,7 +8259,7 @@
       </w:pPr>
       <w:rPr>
         <w:rFonts w:ascii="Wingdings" w:hAnsi="Wingdings" w:hint="default"/>
-        <w:color w:val="02A5B4"/>
+        <w:color w:val="000000"/>
       </w:rPr>
     </w:lvl>
     <w:lvl w:ilvl="1" w:tplc="04160003" w:tentative="1">
@@ -10036,7 +10036,7 @@
     <w:unhideWhenUsed/>
     <w:rsid w:val="004941AA"/>
     <w:rPr>
-      <w:color w:val="0563C1" w:themeColor="hyperlink"/>
+      <w:color w:val="000000"/>
       <w:u w:val="single"/>
     </w:rPr>
   </w:style>

</xml_diff>

<commit_message>
fix(contracts): stabilize footer with fixed columns
</commit_message>
<xml_diff>
--- a/assets/templates/contrato-motive-v1.docx
+++ b/assets/templates/contrato-motive-v1.docx
@@ -6509,1105 +6509,257 @@
 </file>
 
 <file path=word/footer2.xml><?xml version="1.0" encoding="utf-8"?>
-<w:ftr xmlns:wpc="http://schemas.microsoft.com/office/word/2010/wordprocessingCanvas" xmlns:cx="http://schemas.microsoft.com/office/drawing/2014/chartex" xmlns:cx1="http://schemas.microsoft.com/office/drawing/2015/9/8/chartex" xmlns:cx2="http://schemas.microsoft.com/office/drawing/2015/10/21/chartex" xmlns:cx3="http://schemas.microsoft.com/office/drawing/2016/5/9/chartex" xmlns:cx4="http://schemas.microsoft.com/office/drawing/2016/5/10/chartex" xmlns:cx5="http://schemas.microsoft.com/office/drawing/2016/5/11/chartex" xmlns:cx6="http://schemas.microsoft.com/office/drawing/2016/5/12/chartex" xmlns:cx7="http://schemas.microsoft.com/office/drawing/2016/5/13/chartex" xmlns:cx8="http://schemas.microsoft.com/office/drawing/2016/5/14/chartex" xmlns:mc="http://schemas.openxmlformats.org/markup-compatibility/2006" xmlns:aink="http://schemas.microsoft.com/office/drawing/2016/ink" xmlns:am3d="http://schemas.microsoft.com/office/drawing/2017/model3d" xmlns:o="urn:schemas-microsoft-com:office:office" xmlns:oel="http://schemas.microsoft.com/office/2019/extlst" xmlns:r="http://schemas.openxmlformats.org/officeDocument/2006/relationships" xmlns:m="http://schemas.openxmlformats.org/officeDocument/2006/math" xmlns:v="urn:schemas-microsoft-com:vml" xmlns:wp14="http://schemas.microsoft.com/office/word/2010/wordprocessingDrawing" xmlns:wp="http://schemas.openxmlformats.org/drawingml/2006/wordprocessingDrawing" xmlns:w10="urn:schemas-microsoft-com:office:word" xmlns:w="http://schemas.openxmlformats.org/wordprocessingml/2006/main" xmlns:w14="http://schemas.microsoft.com/office/word/2010/wordml" xmlns:w15="http://schemas.microsoft.com/office/word/2012/wordml" xmlns:w16cex="http://schemas.microsoft.com/office/word/2018/wordml/cex" xmlns:w16cid="http://schemas.microsoft.com/office/word/2016/wordml/cid" xmlns:w16="http://schemas.microsoft.com/office/word/2018/wordml" xmlns:w16du="http://schemas.microsoft.com/office/word/2023/wordml/word16du" xmlns:w16sdtdh="http://schemas.microsoft.com/office/word/2020/wordml/sdtdatahash" xmlns:w16sdtfl="http://schemas.microsoft.com/office/word/2024/wordml/sdtformatlock" xmlns:w16se="http://schemas.microsoft.com/office/word/2015/wordml/symex" xmlns:wpg="http://schemas.microsoft.com/office/word/2010/wordprocessingGroup" xmlns:wpi="http://schemas.microsoft.com/office/word/2010/wordprocessingInk" xmlns:wne="http://schemas.microsoft.com/office/word/2006/wordml" xmlns:wps="http://schemas.microsoft.com/office/word/2010/wordprocessingShape" mc:Ignorable="w14 w15 w16se w16cid w16 w16cex w16sdtdh w16sdtfl w16du wp14">
+<w:ftr xmlns:w="http://schemas.openxmlformats.org/wordprocessingml/2006/main">
+  <w:tbl>
+    <w:tblPr>
+      <w:tblW w:w="11906" w:type="dxa"/>
+      <w:jc w:val="left"/>
+      <w:tblInd w:w="-1701" w:type="dxa"/>
+      <w:tblBorders>
+        <w:top w:val="nil"/>
+        <w:left w:val="nil"/>
+        <w:bottom w:val="nil"/>
+        <w:right w:val="nil"/>
+        <w:insideH w:val="nil"/>
+        <w:insideV w:val="nil"/>
+      </w:tblBorders>
+      <w:tblLayout w:type="fixed"/>
+    </w:tblPr>
+    <w:tblGrid>
+      <w:gridCol w:w="4200"/>
+      <w:gridCol w:w="3500"/>
+      <w:gridCol w:w="3786"/>
+      <w:gridCol w:w="420"/>
+    </w:tblGrid>
+    <w:tr>
+      <w:trPr>
+        <w:cantSplit/>
+        <w:trHeight w:val="600" w:hRule="atLeast"/>
+      </w:trPr>
+      <w:tc>
+        <w:tcPr>
+          <w:tcW w:w="4200" w:type="dxa"/>
+          <w:tcBorders/>
+          <w:shd w:val="clear" w:color="auto" w:fill="F7F8FA"/>
+          <w:tcMar>
+            <w:top w:w="120" w:type="dxa"/>
+            <w:left w:w="1701" w:type="dxa"/>
+            <w:bottom w:w="120" w:type="dxa"/>
+            <w:right w:w="180" w:type="dxa"/>
+          </w:tcMar>
+          <w:vAlign w:val="center"/>
+        </w:tcPr>
+        <w:p>
+          <w:pPr>
+            <w:spacing w:before="0" w:after="0" w:line="200" w:lineRule="auto"/>
+            <w:jc w:val="left"/>
+          </w:pPr>
+          <w:r>
+            <w:rPr>
+              <w:rFonts w:ascii="Liberation Sans" w:hAnsi="Liberation Sans" w:cs="Liberation Sans"/>
+              <w:color w:val="000000"/>
+              <w:sz w:val="16"/>
+              <w:szCs w:val="16"/>
+            </w:rPr>
+            <w:t xml:space="preserve">Rua Justino França, 454</w:t>
+          </w:r>
+        </w:p>
+        <w:p>
+          <w:pPr>
+            <w:spacing w:before="0" w:after="0" w:line="200" w:lineRule="auto"/>
+            <w:jc w:val="left"/>
+          </w:pPr>
+          <w:r>
+            <w:rPr>
+              <w:rFonts w:ascii="Liberation Sans" w:hAnsi="Liberation Sans" w:cs="Liberation Sans"/>
+              <w:color w:val="000000"/>
+              <w:sz w:val="16"/>
+              <w:szCs w:val="16"/>
+            </w:rPr>
+            <w:t xml:space="preserve">Jardim São Carlos (Centro)</w:t>
+          </w:r>
+        </w:p>
+        <w:p>
+          <w:pPr>
+            <w:spacing w:before="0" w:after="0" w:line="200" w:lineRule="auto"/>
+            <w:jc w:val="left"/>
+          </w:pPr>
+          <w:r>
+            <w:rPr>
+              <w:rFonts w:ascii="Liberation Sans" w:hAnsi="Liberation Sans" w:cs="Liberation Sans"/>
+              <w:color w:val="000000"/>
+              <w:sz w:val="16"/>
+              <w:szCs w:val="16"/>
+            </w:rPr>
+            <w:t xml:space="preserve">CEP 13170-050 — Sumaré/SP</w:t>
+          </w:r>
+        </w:p>
+      </w:tc>
+      <w:tc>
+        <w:tcPr>
+          <w:tcW w:w="3500" w:type="dxa"/>
+          <w:tcBorders>
+            <w:left w:val="single" w:sz="4" w:color="D8DEE5"/>
+          </w:tcBorders>
+          <w:shd w:val="clear" w:color="auto" w:fill="F7F8FA"/>
+          <w:tcMar>
+            <w:top w:w="120" w:type="dxa"/>
+            <w:left w:w="180" w:type="dxa"/>
+            <w:bottom w:w="120" w:type="dxa"/>
+            <w:right w:w="180" w:type="dxa"/>
+          </w:tcMar>
+          <w:vAlign w:val="center"/>
+        </w:tcPr>
+        <w:p>
+          <w:pPr>
+            <w:spacing w:before="0" w:after="0" w:line="200" w:lineRule="auto"/>
+            <w:jc w:val="left"/>
+          </w:pPr>
+          <w:r>
+            <w:rPr>
+              <w:rFonts w:ascii="Liberation Sans" w:hAnsi="Liberation Sans" w:cs="Liberation Sans"/>
+              <w:color w:val="000000"/>
+              <w:sz w:val="16"/>
+              <w:szCs w:val="16"/>
+            </w:rPr>
+            <w:t xml:space="preserve">(19) 98293-8955</w:t>
+          </w:r>
+        </w:p>
+        <w:p>
+          <w:pPr>
+            <w:spacing w:before="0" w:after="0" w:line="200" w:lineRule="auto"/>
+            <w:jc w:val="left"/>
+          </w:pPr>
+          <w:r>
+            <w:rPr>
+              <w:rFonts w:ascii="Liberation Sans" w:hAnsi="Liberation Sans" w:cs="Liberation Sans"/>
+              <w:color w:val="000000"/>
+              <w:sz w:val="16"/>
+              <w:szCs w:val="16"/>
+            </w:rPr>
+            <w:t xml:space="preserve">motiveimoveis@gmail.com</w:t>
+          </w:r>
+        </w:p>
+        <w:p>
+          <w:pPr>
+            <w:spacing w:before="0" w:after="0" w:line="200" w:lineRule="auto"/>
+            <w:jc w:val="left"/>
+          </w:pPr>
+          <w:r>
+            <w:rPr>
+              <w:rFonts w:ascii="Liberation Sans" w:hAnsi="Liberation Sans" w:cs="Liberation Sans"/>
+              <w:color w:val="000000"/>
+              <w:sz w:val="16"/>
+              <w:szCs w:val="16"/>
+            </w:rPr>
+            <w:t xml:space="preserve">motiveimoveis.com</w:t>
+          </w:r>
+        </w:p>
+      </w:tc>
+      <w:tc>
+        <w:tcPr>
+          <w:tcW w:w="3786" w:type="dxa"/>
+          <w:tcBorders>
+            <w:left w:val="single" w:sz="4" w:color="D8DEE5"/>
+          </w:tcBorders>
+          <w:shd w:val="clear" w:color="auto" w:fill="F7F8FA"/>
+          <w:tcMar>
+            <w:top w:w="120" w:type="dxa"/>
+            <w:left w:w="180" w:type="dxa"/>
+            <w:bottom w:w="120" w:type="dxa"/>
+            <w:right w:w="180" w:type="dxa"/>
+          </w:tcMar>
+          <w:vAlign w:val="center"/>
+        </w:tcPr>
+        <w:p>
+          <w:pPr>
+            <w:spacing w:before="0" w:after="0" w:line="200" w:lineRule="auto"/>
+            <w:jc w:val="left"/>
+          </w:pPr>
+          <w:r>
+            <w:rPr>
+              <w:rFonts w:ascii="Liberation Sans" w:hAnsi="Liberation Sans" w:cs="Liberation Sans"/>
+              <w:b/>
+              <w:bCs/>
+              <w:color w:val="000000"/>
+              <w:sz w:val="16"/>
+              <w:szCs w:val="16"/>
+            </w:rPr>
+            <w:t xml:space="preserve">MOTIVE CONSULTORIA</w:t>
+          </w:r>
+        </w:p>
+        <w:p>
+          <w:pPr>
+            <w:spacing w:before="0" w:after="0" w:line="200" w:lineRule="auto"/>
+            <w:jc w:val="left"/>
+          </w:pPr>
+          <w:r>
+            <w:rPr>
+              <w:rFonts w:ascii="Liberation Sans" w:hAnsi="Liberation Sans" w:cs="Liberation Sans"/>
+              <w:b/>
+              <w:bCs/>
+              <w:color w:val="000000"/>
+              <w:sz w:val="16"/>
+              <w:szCs w:val="16"/>
+            </w:rPr>
+            <w:t xml:space="preserve">IMOBILIÁRIA</w:t>
+          </w:r>
+        </w:p>
+        <w:p>
+          <w:pPr>
+            <w:spacing w:before="0" w:after="0" w:line="200" w:lineRule="auto"/>
+            <w:jc w:val="left"/>
+          </w:pPr>
+          <w:r>
+            <w:rPr>
+              <w:rFonts w:ascii="Liberation Sans" w:hAnsi="Liberation Sans" w:cs="Liberation Sans"/>
+              <w:b/>
+              <w:bCs/>
+              <w:color w:val="000000"/>
+              <w:sz w:val="16"/>
+              <w:szCs w:val="16"/>
+            </w:rPr>
+            <w:t xml:space="preserve">CRECI: 43789J</w:t>
+          </w:r>
+        </w:p>
+      </w:tc>
+      <w:tc>
+        <w:tcPr>
+          <w:tcW w:w="420" w:type="dxa"/>
+          <w:tcBorders/>
+          <w:shd w:val="clear" w:color="auto" w:fill="5A80A1"/>
+          <w:tcMar>
+            <w:top w:w="120" w:type="dxa"/>
+            <w:left w:w="0" w:type="dxa"/>
+            <w:bottom w:w="120" w:type="dxa"/>
+            <w:right w:w="180" w:type="dxa"/>
+          </w:tcMar>
+          <w:vAlign w:val="center"/>
+        </w:tcPr>
+        <w:p>
+          <w:pPr>
+            <w:spacing w:before="0" w:after="0" w:line="200" w:lineRule="auto"/>
+            <w:jc w:val="left"/>
+          </w:pPr>
+          <w:r>
+            <w:rPr>
+              <w:rFonts w:ascii="Liberation Sans" w:hAnsi="Liberation Sans" w:cs="Liberation Sans"/>
+              <w:color w:val="000000"/>
+              <w:sz w:val="16"/>
+              <w:szCs w:val="16"/>
+            </w:rPr>
+            <w:t xml:space="preserve"/>
+          </w:r>
+        </w:p>
+      </w:tc>
+    </w:tr>
+  </w:tbl>
   <w:p>
     <w:pPr>
-      <w:pStyle w:val="Rodap"/>
-    </w:pPr>
-    <w:r>
+      <w:spacing w:before="0" w:after="0" w:line="20" w:lineRule="exact"/>
       <w:rPr>
-        <w:noProof/>
+        <w:sz w:val="2"/>
       </w:rPr>
-      <mc:AlternateContent>
-        <mc:Choice Requires="wps">
-          <w:drawing>
-            <wp:anchor distT="0" distB="0" distL="114300" distR="114300" simplePos="0" relativeHeight="251663360" behindDoc="0" locked="0" layoutInCell="1" allowOverlap="1" wp14:anchorId="2E5D9233" wp14:editId="7F7EA284">
-              <wp:simplePos x="0" y="0"/>
-              <wp:positionH relativeFrom="margin">
-                <wp:posOffset>3821430</wp:posOffset>
-              </wp:positionH>
-              <wp:positionV relativeFrom="paragraph">
-                <wp:posOffset>75565</wp:posOffset>
-              </wp:positionV>
-              <wp:extent cx="2062480" cy="506730"/>
-              <wp:effectExtent l="0" t="0" r="0" b="7620"/>
-              <wp:wrapNone/>
-              <wp:docPr id="52" name="Caixa de Texto 52"/>
-              <wp:cNvGraphicFramePr/>
-              <a:graphic xmlns:a="http://schemas.openxmlformats.org/drawingml/2006/main">
-                <a:graphicData uri="http://schemas.microsoft.com/office/word/2010/wordprocessingShape">
-                  <wps:wsp>
-                    <wps:cNvSpPr txBox="1"/>
-                    <wps:spPr>
-                      <a:xfrm>
-                        <a:off x="0" y="0"/>
-                        <a:ext cx="2062480" cy="506730"/>
-                      </a:xfrm>
-                      <a:prstGeom prst="rect">
-                        <a:avLst/>
-                      </a:prstGeom>
-                      <a:noFill/>
-                      <a:ln w="6350">
-                        <a:noFill/>
-                      </a:ln>
-                    </wps:spPr>
-                    <wps:txbx>
-                      <w:txbxContent>
-                        <w:p>
-                          <w:pPr>
-                            <w:rPr>
-                              <w:rFonts w:ascii="Open Sans" w:hAnsi="Open Sans" w:cs="Open Sans"/>
-                              <w:b/>
-                              <w:bCs/>
-                              <w:sz w:val="16"/>
-                              <w:szCs w:val="16"/>
-                            </w:rPr>
-                          </w:pPr>
-                          <w:r>
-                            <w:rPr>
-                              <w:rFonts w:ascii="Open Sans" w:hAnsi="Open Sans" w:cs="Open Sans"/>
-                              <w:b/>
-                              <w:bCs/>
-                              <w:sz w:val="16"/>
-                              <w:szCs w:val="16"/>
-                            </w:rPr>
-                            <w:t>MOTIVE CONSULTORIA IMOBILIÁRIA</w:t>
-                          </w:r>
-                        </w:p>
-                        <w:p>
-                          <w:pPr>
-                            <w:rPr>
-                              <w:rFonts w:ascii="Open Sans" w:hAnsi="Open Sans" w:cs="Open Sans"/>
-                              <w:sz w:val="16"/>
-                              <w:szCs w:val="16"/>
-                            </w:rPr>
-                          </w:pPr>
-                          <w:r>
-                            <w:rPr>
-                              <w:rFonts w:ascii="Open Sans" w:hAnsi="Open Sans" w:cs="Open Sans"/>
-                              <w:b/>
-                              <w:bCs/>
-                              <w:sz w:val="16"/>
-                              <w:szCs w:val="16"/>
-                            </w:rPr>
-                            <w:t>CRECI</w:t>
-                          </w:r>
-                          <w:r>
-                            <w:rPr>
-                              <w:rFonts w:ascii="Open Sans" w:hAnsi="Open Sans" w:cs="Open Sans"/>
-                              <w:b/>
-                              <w:bCs/>
-                              <w:sz w:val="16"/>
-                              <w:szCs w:val="16"/>
-                            </w:rPr>
-                            <w:t>:</w:t>
-                          </w:r>
-                          <w:r>
-                            <w:rPr>
-                              <w:rFonts w:ascii="Open Sans" w:hAnsi="Open Sans" w:cs="Open Sans"/>
-                              <w:sz w:val="16"/>
-                              <w:szCs w:val="16"/>
-                            </w:rPr>
-                            <w:t xml:space="preserve"> </w:t>
-                          </w:r>
-                          <w:r>
-                            <w:rPr>
-                              <w:rFonts w:ascii="Open Sans" w:hAnsi="Open Sans" w:cs="Open Sans"/>
-                              <w:sz w:val="16"/>
-                              <w:szCs w:val="16"/>
-                            </w:rPr>
-                            <w:t>43789J</w:t>
-                          </w:r>
-                        </w:p>
-                        <w:p>
-                          <w:pPr>
-                            <w:rPr>
-                              <w:rFonts w:ascii="Open Sans" w:hAnsi="Open Sans" w:cs="Open Sans"/>
-                              <w:b/>
-                              <w:bCs/>
-                              <w:sz w:val="16"/>
-                              <w:szCs w:val="16"/>
-                            </w:rPr>
-                          </w:pPr>
-                        </w:p>
-                      </w:txbxContent>
-                    </wps:txbx>
-                    <wps:bodyPr rot="0" spcFirstLastPara="0" vertOverflow="overflow" horzOverflow="overflow" vert="horz" wrap="square" lIns="91440" tIns="45720" rIns="91440" bIns="45720" numCol="1" spcCol="0" rtlCol="0" fromWordArt="0" anchor="t" anchorCtr="0" forceAA="0" compatLnSpc="1">
-                      <a:prstTxWarp prst="textNoShape">
-                        <a:avLst/>
-                      </a:prstTxWarp>
-                      <a:noAutofit/>
-                    </wps:bodyPr>
-                  </wps:wsp>
-                </a:graphicData>
-              </a:graphic>
-              <wp14:sizeRelH relativeFrom="margin">
-                <wp14:pctWidth>0</wp14:pctWidth>
-              </wp14:sizeRelH>
-              <wp14:sizeRelV relativeFrom="margin">
-                <wp14:pctHeight>0</wp14:pctHeight>
-              </wp14:sizeRelV>
-            </wp:anchor>
-          </w:drawing>
-        </mc:Choice>
-        <mc:Fallback>
-          <w:pict>
-            <v:shapetype w14:anchorId="2E5D9233" id="_x0000_t202" coordsize="21600,21600" o:spt="202" path="m,l,21600r21600,l21600,xe">
-              <v:stroke joinstyle="miter"/>
-              <v:path gradientshapeok="t" o:connecttype="rect"/>
-            </v:shapetype>
-            <v:shape id="Caixa de Texto 52" o:spid="_x0000_s1037" type="#_x0000_t202" style="position:absolute;margin-left:300.9pt;margin-top:5.95pt;width:162.4pt;height:39.9pt;z-index:251663360;visibility:visible;mso-wrap-style:square;mso-width-percent:0;mso-height-percent:0;mso-wrap-distance-left:9pt;mso-wrap-distance-top:0;mso-wrap-distance-right:9pt;mso-wrap-distance-bottom:0;mso-position-horizontal:absolute;mso-position-horizontal-relative:margin;mso-position-vertical:absolute;mso-position-vertical-relative:text;mso-width-percent:0;mso-height-percent:0;mso-width-relative:margin;mso-height-relative:margin;v-text-anchor:top" o:gfxdata="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" filled="f" stroked="f" strokeweight=".5pt">
-              <v:textbox>
-                <w:txbxContent>
-                  <w:p>
-                    <w:pPr>
-                      <w:rPr>
-                        <w:rFonts w:ascii="Open Sans" w:hAnsi="Open Sans" w:cs="Open Sans"/>
-                        <w:b/>
-                        <w:bCs/>
-                        <w:sz w:val="16"/>
-                        <w:szCs w:val="16"/>
-                      </w:rPr>
-                    </w:pPr>
-                    <w:r>
-                      <w:rPr>
-                        <w:rFonts w:ascii="Open Sans" w:hAnsi="Open Sans" w:cs="Open Sans"/>
-                        <w:b/>
-                        <w:bCs/>
-                        <w:sz w:val="16"/>
-                        <w:szCs w:val="16"/>
-                      </w:rPr>
-                      <w:t>MOTIVE CONSULTORIA IMOBILIÁRIA</w:t>
-                    </w:r>
-                  </w:p>
-                  <w:p>
-                    <w:pPr>
-                      <w:rPr>
-                        <w:rFonts w:ascii="Open Sans" w:hAnsi="Open Sans" w:cs="Open Sans"/>
-                        <w:sz w:val="16"/>
-                        <w:szCs w:val="16"/>
-                      </w:rPr>
-                    </w:pPr>
-                    <w:r>
-                      <w:rPr>
-                        <w:rFonts w:ascii="Open Sans" w:hAnsi="Open Sans" w:cs="Open Sans"/>
-                        <w:b/>
-                        <w:bCs/>
-                        <w:sz w:val="16"/>
-                        <w:szCs w:val="16"/>
-                      </w:rPr>
-                      <w:t>CRECI</w:t>
-                    </w:r>
-                    <w:r>
-                      <w:rPr>
-                        <w:rFonts w:ascii="Open Sans" w:hAnsi="Open Sans" w:cs="Open Sans"/>
-                        <w:b/>
-                        <w:bCs/>
-                        <w:sz w:val="16"/>
-                        <w:szCs w:val="16"/>
-                      </w:rPr>
-                      <w:t>:</w:t>
-                    </w:r>
-                    <w:r>
-                      <w:rPr>
-                        <w:rFonts w:ascii="Open Sans" w:hAnsi="Open Sans" w:cs="Open Sans"/>
-                        <w:sz w:val="16"/>
-                        <w:szCs w:val="16"/>
-                      </w:rPr>
-                      <w:t xml:space="preserve"> </w:t>
-                    </w:r>
-                    <w:r>
-                      <w:rPr>
-                        <w:rFonts w:ascii="Open Sans" w:hAnsi="Open Sans" w:cs="Open Sans"/>
-                        <w:sz w:val="16"/>
-                        <w:szCs w:val="16"/>
-                      </w:rPr>
-                      <w:t>43789J</w:t>
-                    </w:r>
-                  </w:p>
-                  <w:p>
-                    <w:pPr>
-                      <w:rPr>
-                        <w:rFonts w:ascii="Open Sans" w:hAnsi="Open Sans" w:cs="Open Sans"/>
-                        <w:b/>
-                        <w:bCs/>
-                        <w:sz w:val="16"/>
-                        <w:szCs w:val="16"/>
-                      </w:rPr>
-                    </w:pPr>
-                  </w:p>
-                </w:txbxContent>
-              </v:textbox>
-              <w10:wrap anchorx="margin"/>
-            </v:shape>
-          </w:pict>
-        </mc:Fallback>
-      </mc:AlternateContent>
-    </w:r>
-    <w:r>
-      <w:rPr>
-        <w:noProof/>
-      </w:rPr>
-      <mc:AlternateContent>
-        <mc:Choice Requires="wps">
-          <w:drawing>
-            <wp:anchor distT="0" distB="0" distL="114300" distR="114300" simplePos="0" relativeHeight="251660288" behindDoc="0" locked="0" layoutInCell="1" allowOverlap="1" wp14:anchorId="1AD2D8C7" wp14:editId="00315460">
-              <wp:simplePos x="0" y="0"/>
-              <wp:positionH relativeFrom="column">
-                <wp:posOffset>-66675</wp:posOffset>
-              </wp:positionH>
-              <wp:positionV relativeFrom="paragraph">
-                <wp:posOffset>64770</wp:posOffset>
-              </wp:positionV>
-              <wp:extent cx="1928495" cy="548640"/>
-              <wp:effectExtent l="0" t="0" r="0" b="3810"/>
-              <wp:wrapNone/>
-              <wp:docPr id="40" name="Caixa de Texto 40"/>
-              <wp:cNvGraphicFramePr/>
-              <a:graphic xmlns:a="http://schemas.openxmlformats.org/drawingml/2006/main">
-                <a:graphicData uri="http://schemas.microsoft.com/office/word/2010/wordprocessingShape">
-                  <wps:wsp>
-                    <wps:cNvSpPr txBox="1"/>
-                    <wps:spPr>
-                      <a:xfrm>
-                        <a:off x="0" y="0"/>
-                        <a:ext cx="1928495" cy="548640"/>
-                      </a:xfrm>
-                      <a:prstGeom prst="rect">
-                        <a:avLst/>
-                      </a:prstGeom>
-                      <a:noFill/>
-                      <a:ln w="6350">
-                        <a:noFill/>
-                      </a:ln>
-                    </wps:spPr>
-                    <wps:txbx>
-                      <w:txbxContent>
-                        <w:p>
-                          <w:pPr>
-                            <w:spacing w:after="0"/>
-                            <w:jc w:val="right"/>
-                            <w:rPr>
-                              <w:rFonts w:ascii="Open Sans" w:hAnsi="Open Sans" w:cs="Open Sans"/>
-                              <w:sz w:val="16"/>
-                              <w:szCs w:val="16"/>
-                            </w:rPr>
-                          </w:pPr>
-                          <w:r>
-                            <w:rPr>
-                              <w:rFonts w:ascii="Open Sans" w:hAnsi="Open Sans" w:cs="Open Sans"/>
-                              <w:sz w:val="16"/>
-                              <w:szCs w:val="16"/>
-                            </w:rPr>
-                            <w:t>Rua Justino França, 454</w:t>
-                          </w:r>
-                        </w:p>
-                        <w:p>
-                          <w:pPr>
-                            <w:spacing w:after="0"/>
-                            <w:jc w:val="right"/>
-                            <w:rPr>
-                              <w:rFonts w:ascii="Open Sans" w:hAnsi="Open Sans" w:cs="Open Sans"/>
-                              <w:sz w:val="16"/>
-                              <w:szCs w:val="16"/>
-                            </w:rPr>
-                          </w:pPr>
-                          <w:r>
-                            <w:rPr>
-                              <w:rFonts w:ascii="Open Sans" w:hAnsi="Open Sans" w:cs="Open Sans"/>
-                              <w:sz w:val="16"/>
-                              <w:szCs w:val="16"/>
-                            </w:rPr>
-                            <w:t>Jardim São Carlos (Centro)</w:t>
-                          </w:r>
-                        </w:p>
-                        <w:p>
-                          <w:pPr>
-                            <w:spacing w:after="0"/>
-                            <w:jc w:val="right"/>
-                            <w:rPr>
-                              <w:rFonts w:ascii="Open Sans" w:hAnsi="Open Sans" w:cs="Open Sans"/>
-                              <w:sz w:val="16"/>
-                              <w:szCs w:val="16"/>
-                            </w:rPr>
-                          </w:pPr>
-                          <w:r>
-                            <w:rPr>
-                              <w:rFonts w:ascii="Open Sans" w:hAnsi="Open Sans" w:cs="Open Sans"/>
-                              <w:sz w:val="16"/>
-                              <w:szCs w:val="16"/>
-                            </w:rPr>
-                            <w:t xml:space="preserve"> CEP: </w:t>
-                          </w:r>
-                          <w:r>
-                            <w:rPr>
-                              <w:rFonts w:ascii="Open Sans" w:hAnsi="Open Sans" w:cs="Open Sans"/>
-                              <w:sz w:val="16"/>
-                              <w:szCs w:val="16"/>
-                            </w:rPr>
-                            <w:t>13170-050</w:t>
-                          </w:r>
-                          <w:r>
-                            <w:rPr>
-                              <w:rFonts w:ascii="Open Sans" w:hAnsi="Open Sans" w:cs="Open Sans"/>
-                              <w:sz w:val="16"/>
-                              <w:szCs w:val="16"/>
-                            </w:rPr>
-                            <w:t>,</w:t>
-                          </w:r>
-                          <w:r>
-                            <w:rPr>
-                              <w:rFonts w:ascii="Open Sans" w:hAnsi="Open Sans" w:cs="Open Sans"/>
-                              <w:sz w:val="16"/>
-                              <w:szCs w:val="16"/>
-                            </w:rPr>
-                            <w:t xml:space="preserve"> </w:t>
-                          </w:r>
-                          <w:r>
-                            <w:rPr>
-                              <w:rFonts w:ascii="Open Sans" w:hAnsi="Open Sans" w:cs="Open Sans"/>
-                              <w:sz w:val="16"/>
-                              <w:szCs w:val="16"/>
-                            </w:rPr>
-                            <w:t>Sumaré</w:t>
-                          </w:r>
-                          <w:r>
-                            <w:rPr>
-                              <w:rFonts w:ascii="Open Sans" w:hAnsi="Open Sans" w:cs="Open Sans"/>
-                              <w:sz w:val="16"/>
-                              <w:szCs w:val="16"/>
-                            </w:rPr>
-                            <w:t xml:space="preserve"> – </w:t>
-                          </w:r>
-                          <w:r>
-                            <w:rPr>
-                              <w:rFonts w:ascii="Open Sans" w:hAnsi="Open Sans" w:cs="Open Sans"/>
-                              <w:sz w:val="16"/>
-                              <w:szCs w:val="16"/>
-                            </w:rPr>
-                            <w:t>SP</w:t>
-                          </w:r>
-                        </w:p>
-                      </w:txbxContent>
-                    </wps:txbx>
-                    <wps:bodyPr rot="0" spcFirstLastPara="0" vertOverflow="overflow" horzOverflow="overflow" vert="horz" wrap="square" lIns="91440" tIns="45720" rIns="91440" bIns="45720" numCol="1" spcCol="0" rtlCol="0" fromWordArt="0" anchor="t" anchorCtr="0" forceAA="0" compatLnSpc="1">
-                      <a:prstTxWarp prst="textNoShape">
-                        <a:avLst/>
-                      </a:prstTxWarp>
-                      <a:noAutofit/>
-                    </wps:bodyPr>
-                  </wps:wsp>
-                </a:graphicData>
-              </a:graphic>
-              <wp14:sizeRelH relativeFrom="margin">
-                <wp14:pctWidth>0</wp14:pctWidth>
-              </wp14:sizeRelH>
-              <wp14:sizeRelV relativeFrom="margin">
-                <wp14:pctHeight>0</wp14:pctHeight>
-              </wp14:sizeRelV>
-            </wp:anchor>
-          </w:drawing>
-        </mc:Choice>
-        <mc:Fallback>
-          <w:pict>
-            <v:shape w14:anchorId="1AD2D8C7" id="Caixa de Texto 40" o:spid="_x0000_s1038" type="#_x0000_t202" style="position:absolute;margin-left:-5.25pt;margin-top:5.1pt;width:151.85pt;height:43.2pt;z-index:251660288;visibility:visible;mso-wrap-style:square;mso-width-percent:0;mso-height-percent:0;mso-wrap-distance-left:9pt;mso-wrap-distance-top:0;mso-wrap-distance-right:9pt;mso-wrap-distance-bottom:0;mso-position-horizontal:absolute;mso-position-horizontal-relative:text;mso-position-vertical:absolute;mso-position-vertical-relative:text;mso-width-percent:0;mso-height-percent:0;mso-width-relative:margin;mso-height-relative:margin;v-text-anchor:top" o:gfxdata="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" filled="f" stroked="f" strokeweight=".5pt">
-              <v:textbox>
-                <w:txbxContent>
-                  <w:p>
-                    <w:pPr>
-                      <w:spacing w:after="0"/>
-                      <w:jc w:val="right"/>
-                      <w:rPr>
-                        <w:rFonts w:ascii="Open Sans" w:hAnsi="Open Sans" w:cs="Open Sans"/>
-                        <w:sz w:val="16"/>
-                        <w:szCs w:val="16"/>
-                      </w:rPr>
-                    </w:pPr>
-                    <w:r>
-                      <w:rPr>
-                        <w:rFonts w:ascii="Open Sans" w:hAnsi="Open Sans" w:cs="Open Sans"/>
-                        <w:sz w:val="16"/>
-                        <w:szCs w:val="16"/>
-                      </w:rPr>
-                      <w:t>Rua Justino França, 454</w:t>
-                    </w:r>
-                  </w:p>
-                  <w:p>
-                    <w:pPr>
-                      <w:spacing w:after="0"/>
-                      <w:jc w:val="right"/>
-                      <w:rPr>
-                        <w:rFonts w:ascii="Open Sans" w:hAnsi="Open Sans" w:cs="Open Sans"/>
-                        <w:sz w:val="16"/>
-                        <w:szCs w:val="16"/>
-                      </w:rPr>
-                    </w:pPr>
-                    <w:r>
-                      <w:rPr>
-                        <w:rFonts w:ascii="Open Sans" w:hAnsi="Open Sans" w:cs="Open Sans"/>
-                        <w:sz w:val="16"/>
-                        <w:szCs w:val="16"/>
-                      </w:rPr>
-                      <w:t>Jardim São Carlos (Centro)</w:t>
-                    </w:r>
-                  </w:p>
-                  <w:p>
-                    <w:pPr>
-                      <w:spacing w:after="0"/>
-                      <w:jc w:val="right"/>
-                      <w:rPr>
-                        <w:rFonts w:ascii="Open Sans" w:hAnsi="Open Sans" w:cs="Open Sans"/>
-                        <w:sz w:val="16"/>
-                        <w:szCs w:val="16"/>
-                      </w:rPr>
-                    </w:pPr>
-                    <w:r>
-                      <w:rPr>
-                        <w:rFonts w:ascii="Open Sans" w:hAnsi="Open Sans" w:cs="Open Sans"/>
-                        <w:sz w:val="16"/>
-                        <w:szCs w:val="16"/>
-                      </w:rPr>
-                      <w:t xml:space="preserve"> CEP: </w:t>
-                    </w:r>
-                    <w:r>
-                      <w:rPr>
-                        <w:rFonts w:ascii="Open Sans" w:hAnsi="Open Sans" w:cs="Open Sans"/>
-                        <w:sz w:val="16"/>
-                        <w:szCs w:val="16"/>
-                      </w:rPr>
-                      <w:t>13170-050</w:t>
-                    </w:r>
-                    <w:r>
-                      <w:rPr>
-                        <w:rFonts w:ascii="Open Sans" w:hAnsi="Open Sans" w:cs="Open Sans"/>
-                        <w:sz w:val="16"/>
-                        <w:szCs w:val="16"/>
-                      </w:rPr>
-                      <w:t>,</w:t>
-                    </w:r>
-                    <w:r>
-                      <w:rPr>
-                        <w:rFonts w:ascii="Open Sans" w:hAnsi="Open Sans" w:cs="Open Sans"/>
-                        <w:sz w:val="16"/>
-                        <w:szCs w:val="16"/>
-                      </w:rPr>
-                      <w:t xml:space="preserve"> </w:t>
-                    </w:r>
-                    <w:r>
-                      <w:rPr>
-                        <w:rFonts w:ascii="Open Sans" w:hAnsi="Open Sans" w:cs="Open Sans"/>
-                        <w:sz w:val="16"/>
-                        <w:szCs w:val="16"/>
-                      </w:rPr>
-                      <w:t>Sumaré</w:t>
-                    </w:r>
-                    <w:r>
-                      <w:rPr>
-                        <w:rFonts w:ascii="Open Sans" w:hAnsi="Open Sans" w:cs="Open Sans"/>
-                        <w:sz w:val="16"/>
-                        <w:szCs w:val="16"/>
-                      </w:rPr>
-                      <w:t xml:space="preserve"> – </w:t>
-                    </w:r>
-                    <w:r>
-                      <w:rPr>
-                        <w:rFonts w:ascii="Open Sans" w:hAnsi="Open Sans" w:cs="Open Sans"/>
-                        <w:sz w:val="16"/>
-                        <w:szCs w:val="16"/>
-                      </w:rPr>
-                      <w:t>SP</w:t>
-                    </w:r>
-                  </w:p>
-                </w:txbxContent>
-              </v:textbox>
-            </v:shape>
-          </w:pict>
-        </mc:Fallback>
-      </mc:AlternateContent>
-    </w:r>
-    <w:r>
-      <w:rPr>
-        <w:noProof/>
-      </w:rPr>
-      <mc:AlternateContent>
-        <mc:Choice Requires="wps">
-          <w:drawing>
-            <wp:anchor distT="0" distB="0" distL="114300" distR="114300" simplePos="0" relativeHeight="251661312" behindDoc="0" locked="0" layoutInCell="1" allowOverlap="1" wp14:anchorId="650CA0A1" wp14:editId="305340F6">
-              <wp:simplePos x="0" y="0"/>
-              <wp:positionH relativeFrom="column">
-                <wp:posOffset>1891665</wp:posOffset>
-              </wp:positionH>
-              <wp:positionV relativeFrom="paragraph">
-                <wp:posOffset>88570</wp:posOffset>
-              </wp:positionV>
-              <wp:extent cx="1691640" cy="602615"/>
-              <wp:effectExtent l="0" t="0" r="0" b="6985"/>
-              <wp:wrapNone/>
-              <wp:docPr id="43" name="Caixa de Texto 43"/>
-              <wp:cNvGraphicFramePr/>
-              <a:graphic xmlns:a="http://schemas.openxmlformats.org/drawingml/2006/main">
-                <a:graphicData uri="http://schemas.microsoft.com/office/word/2010/wordprocessingShape">
-                  <wps:wsp>
-                    <wps:cNvSpPr txBox="1"/>
-                    <wps:spPr>
-                      <a:xfrm>
-                        <a:off x="0" y="0"/>
-                        <a:ext cx="1691640" cy="602615"/>
-                      </a:xfrm>
-                      <a:prstGeom prst="rect">
-                        <a:avLst/>
-                      </a:prstGeom>
-                      <a:noFill/>
-                      <a:ln w="6350">
-                        <a:noFill/>
-                      </a:ln>
-                    </wps:spPr>
-                    <wps:txbx>
-                      <w:txbxContent>
-                        <w:p>
-                          <w:pPr>
-                            <w:spacing w:after="0"/>
-                            <w:jc w:val="right"/>
-                            <w:rPr>
-                              <w:rFonts w:ascii="Open Sans" w:hAnsi="Open Sans" w:cs="Open Sans"/>
-                              <w:sz w:val="16"/>
-                              <w:szCs w:val="16"/>
-                            </w:rPr>
-                          </w:pPr>
-                          <w:r>
-                            <w:rPr>
-                              <w:rFonts w:ascii="Open Sans" w:hAnsi="Open Sans" w:cs="Open Sans"/>
-                              <w:sz w:val="16"/>
-                              <w:szCs w:val="16"/>
-                            </w:rPr>
-                            <w:t xml:space="preserve"> (</w:t>
-                          </w:r>
-                          <w:r>
-                            <w:rPr>
-                              <w:rFonts w:ascii="Open Sans" w:hAnsi="Open Sans" w:cs="Open Sans"/>
-                              <w:sz w:val="16"/>
-                              <w:szCs w:val="16"/>
-                            </w:rPr>
-                            <w:t>19</w:t>
-                          </w:r>
-                          <w:r>
-                            <w:rPr>
-                              <w:rFonts w:ascii="Open Sans" w:hAnsi="Open Sans" w:cs="Open Sans"/>
-                              <w:sz w:val="16"/>
-                              <w:szCs w:val="16"/>
-                            </w:rPr>
-                            <w:t xml:space="preserve">) </w:t>
-                          </w:r>
-                          <w:r>
-                            <w:rPr>
-                              <w:rFonts w:ascii="Open Sans" w:hAnsi="Open Sans" w:cs="Open Sans"/>
-                              <w:sz w:val="16"/>
-                              <w:szCs w:val="16"/>
-                            </w:rPr>
-                            <w:t>98293-8955</w:t>
-                          </w:r>
-                        </w:p>
-                        <w:p>
-                          <w:pPr>
-                            <w:spacing w:after="0"/>
-                            <w:jc w:val="right"/>
-                            <w:rPr>
-                              <w:rFonts w:ascii="Open Sans" w:hAnsi="Open Sans" w:cs="Open Sans"/>
-                              <w:sz w:val="16"/>
-                              <w:szCs w:val="16"/>
-                            </w:rPr>
-                          </w:pPr>
-                          <w:hyperlink r:id="rId1" w:history="1">
-                            <w:r>
-                              <w:rPr>
-                                <w:rStyle w:val="Hyperlink"/>
-                                <w:rFonts w:ascii="Open Sans" w:hAnsi="Open Sans" w:cs="Open Sans"/>
-                                <w:sz w:val="16"/>
-                                <w:szCs w:val="16"/>
-                              </w:rPr>
-                              <w:t>motiveimoveis@gmail.com</w:t>
-                            </w:r>
-                          </w:hyperlink>
-                        </w:p>
-                        <w:p>
-                          <w:pPr>
-                            <w:spacing w:after="0"/>
-                            <w:jc w:val="right"/>
-                            <w:rPr>
-                              <w:rFonts w:ascii="Open Sans" w:hAnsi="Open Sans" w:cs="Open Sans"/>
-                              <w:sz w:val="16"/>
-                              <w:szCs w:val="16"/>
-                            </w:rPr>
-                          </w:pPr>
-                          <w:r>
-                            <w:rPr>
-                              <w:rFonts w:ascii="Open Sans" w:hAnsi="Open Sans" w:cs="Open Sans"/>
-                              <w:sz w:val="16"/>
-                              <w:szCs w:val="16"/>
-                            </w:rPr>
-                            <w:t>motiveimoveis.com</w:t>
-                          </w:r>
-                        </w:p>
-                        <w:p>
-                          <w:pPr>
-                            <w:spacing w:after="0"/>
-                            <w:jc w:val="right"/>
-                            <w:rPr>
-                              <w:rFonts w:ascii="Open Sans" w:hAnsi="Open Sans" w:cs="Open Sans"/>
-                              <w:sz w:val="16"/>
-                              <w:szCs w:val="16"/>
-                            </w:rPr>
-                          </w:pPr>
-                        </w:p>
-                        <w:p>
-                          <w:pPr>
-                            <w:spacing w:after="0"/>
-                            <w:jc w:val="right"/>
-                            <w:rPr>
-                              <w:rFonts w:ascii="Open Sans" w:hAnsi="Open Sans" w:cs="Open Sans"/>
-                              <w:sz w:val="16"/>
-                              <w:szCs w:val="16"/>
-                            </w:rPr>
-                          </w:pPr>
-                        </w:p>
-                      </w:txbxContent>
-                    </wps:txbx>
-                    <wps:bodyPr rot="0" spcFirstLastPara="0" vertOverflow="overflow" horzOverflow="overflow" vert="horz" wrap="square" lIns="91440" tIns="45720" rIns="91440" bIns="45720" numCol="1" spcCol="0" rtlCol="0" fromWordArt="0" anchor="t" anchorCtr="0" forceAA="0" compatLnSpc="1">
-                      <a:prstTxWarp prst="textNoShape">
-                        <a:avLst/>
-                      </a:prstTxWarp>
-                      <a:noAutofit/>
-                    </wps:bodyPr>
-                  </wps:wsp>
-                </a:graphicData>
-              </a:graphic>
-              <wp14:sizeRelV relativeFrom="margin">
-                <wp14:pctHeight>0</wp14:pctHeight>
-              </wp14:sizeRelV>
-            </wp:anchor>
-          </w:drawing>
-        </mc:Choice>
-        <mc:Fallback>
-          <w:pict>
-            <v:shape w14:anchorId="650CA0A1" id="Caixa de Texto 43" o:spid="_x0000_s1039" type="#_x0000_t202" style="position:absolute;margin-left:148.95pt;margin-top:6.95pt;width:133.2pt;height:47.45pt;z-index:251661312;visibility:visible;mso-wrap-style:square;mso-height-percent:0;mso-wrap-distance-left:9pt;mso-wrap-distance-top:0;mso-wrap-distance-right:9pt;mso-wrap-distance-bottom:0;mso-position-horizontal:absolute;mso-position-horizontal-relative:text;mso-position-vertical:absolute;mso-position-vertical-relative:text;mso-height-percent:0;mso-height-relative:margin;v-text-anchor:top" o:gfxdata="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" filled="f" stroked="f" strokeweight=".5pt">
-              <v:textbox>
-                <w:txbxContent>
-                  <w:p>
-                    <w:pPr>
-                      <w:spacing w:after="0"/>
-                      <w:jc w:val="right"/>
-                      <w:rPr>
-                        <w:rFonts w:ascii="Open Sans" w:hAnsi="Open Sans" w:cs="Open Sans"/>
-                        <w:sz w:val="16"/>
-                        <w:szCs w:val="16"/>
-                      </w:rPr>
-                    </w:pPr>
-                    <w:r>
-                      <w:rPr>
-                        <w:rFonts w:ascii="Open Sans" w:hAnsi="Open Sans" w:cs="Open Sans"/>
-                        <w:sz w:val="16"/>
-                        <w:szCs w:val="16"/>
-                      </w:rPr>
-                      <w:t xml:space="preserve"> (</w:t>
-                    </w:r>
-                    <w:r>
-                      <w:rPr>
-                        <w:rFonts w:ascii="Open Sans" w:hAnsi="Open Sans" w:cs="Open Sans"/>
-                        <w:sz w:val="16"/>
-                        <w:szCs w:val="16"/>
-                      </w:rPr>
-                      <w:t>19</w:t>
-                    </w:r>
-                    <w:r>
-                      <w:rPr>
-                        <w:rFonts w:ascii="Open Sans" w:hAnsi="Open Sans" w:cs="Open Sans"/>
-                        <w:sz w:val="16"/>
-                        <w:szCs w:val="16"/>
-                      </w:rPr>
-                      <w:t xml:space="preserve">) </w:t>
-                    </w:r>
-                    <w:r>
-                      <w:rPr>
-                        <w:rFonts w:ascii="Open Sans" w:hAnsi="Open Sans" w:cs="Open Sans"/>
-                        <w:sz w:val="16"/>
-                        <w:szCs w:val="16"/>
-                      </w:rPr>
-                      <w:t>98293-8955</w:t>
-                    </w:r>
-                  </w:p>
-                  <w:p>
-                    <w:pPr>
-                      <w:spacing w:after="0"/>
-                      <w:jc w:val="right"/>
-                      <w:rPr>
-                        <w:rFonts w:ascii="Open Sans" w:hAnsi="Open Sans" w:cs="Open Sans"/>
-                        <w:sz w:val="16"/>
-                        <w:szCs w:val="16"/>
-                      </w:rPr>
-                    </w:pPr>
-                    <w:hyperlink r:id="rId2" w:history="1">
-                      <w:r>
-                        <w:rPr>
-                          <w:rStyle w:val="Hyperlink"/>
-                          <w:rFonts w:ascii="Open Sans" w:hAnsi="Open Sans" w:cs="Open Sans"/>
-                          <w:sz w:val="16"/>
-                          <w:szCs w:val="16"/>
-                        </w:rPr>
-                        <w:t>motiveimoveis@gmail.com</w:t>
-                      </w:r>
-                    </w:hyperlink>
-                  </w:p>
-                  <w:p>
-                    <w:pPr>
-                      <w:spacing w:after="0"/>
-                      <w:jc w:val="right"/>
-                      <w:rPr>
-                        <w:rFonts w:ascii="Open Sans" w:hAnsi="Open Sans" w:cs="Open Sans"/>
-                        <w:sz w:val="16"/>
-                        <w:szCs w:val="16"/>
-                      </w:rPr>
-                    </w:pPr>
-                    <w:r>
-                      <w:rPr>
-                        <w:rFonts w:ascii="Open Sans" w:hAnsi="Open Sans" w:cs="Open Sans"/>
-                        <w:sz w:val="16"/>
-                        <w:szCs w:val="16"/>
-                      </w:rPr>
-                      <w:t>motiveimoveis.com</w:t>
-                    </w:r>
-                  </w:p>
-                  <w:p>
-                    <w:pPr>
-                      <w:spacing w:after="0"/>
-                      <w:jc w:val="right"/>
-                      <w:rPr>
-                        <w:rFonts w:ascii="Open Sans" w:hAnsi="Open Sans" w:cs="Open Sans"/>
-                        <w:sz w:val="16"/>
-                        <w:szCs w:val="16"/>
-                      </w:rPr>
-                    </w:pPr>
-                  </w:p>
-                  <w:p>
-                    <w:pPr>
-                      <w:spacing w:after="0"/>
-                      <w:jc w:val="right"/>
-                      <w:rPr>
-                        <w:rFonts w:ascii="Open Sans" w:hAnsi="Open Sans" w:cs="Open Sans"/>
-                        <w:sz w:val="16"/>
-                        <w:szCs w:val="16"/>
-                      </w:rPr>
-                    </w:pPr>
-                  </w:p>
-                </w:txbxContent>
-              </v:textbox>
-            </v:shape>
-          </w:pict>
-        </mc:Fallback>
-      </mc:AlternateContent>
-    </w:r>
-    <w:r>
-      <w:rPr>
-        <w:noProof/>
-      </w:rPr>
-      <mc:AlternateContent>
-        <mc:Choice Requires="wps">
-          <w:drawing>
-            <wp:anchor distT="0" distB="0" distL="114300" distR="114300" simplePos="0" relativeHeight="251664384" behindDoc="0" locked="0" layoutInCell="1" allowOverlap="1" wp14:anchorId="66230769" wp14:editId="25AFC5D7">
-              <wp:simplePos x="0" y="0"/>
-              <wp:positionH relativeFrom="column">
-                <wp:posOffset>3643630</wp:posOffset>
-              </wp:positionH>
-              <wp:positionV relativeFrom="paragraph">
-                <wp:posOffset>108585</wp:posOffset>
-              </wp:positionV>
-              <wp:extent cx="0" cy="482600"/>
-              <wp:effectExtent l="0" t="0" r="38100" b="31750"/>
-              <wp:wrapNone/>
-              <wp:docPr id="54" name="Conector reto 54"/>
-              <wp:cNvGraphicFramePr/>
-              <a:graphic xmlns:a="http://schemas.openxmlformats.org/drawingml/2006/main">
-                <a:graphicData uri="http://schemas.microsoft.com/office/word/2010/wordprocessingShape">
-                  <wps:wsp>
-                    <wps:cNvCnPr/>
-                    <wps:spPr>
-                      <a:xfrm flipH="1">
-                        <a:off x="0" y="0"/>
-                        <a:ext cx="0" cy="482600"/>
-                      </a:xfrm>
-                      <a:prstGeom prst="line">
-                        <a:avLst/>
-                      </a:prstGeom>
-                      <a:ln>
-                        <a:solidFill>
-                          <a:schemeClr val="tx1"/>
-                        </a:solidFill>
-                      </a:ln>
-                    </wps:spPr>
-                    <wps:style>
-                      <a:lnRef idx="1">
-                        <a:schemeClr val="accent6"/>
-                      </a:lnRef>
-                      <a:fillRef idx="0">
-                        <a:schemeClr val="accent6"/>
-                      </a:fillRef>
-                      <a:effectRef idx="0">
-                        <a:schemeClr val="accent6"/>
-                      </a:effectRef>
-                      <a:fontRef idx="minor">
-                        <a:schemeClr val="tx1"/>
-                      </a:fontRef>
-                    </wps:style>
-                    <wps:bodyPr/>
-                  </wps:wsp>
-                </a:graphicData>
-              </a:graphic>
-            </wp:anchor>
-          </w:drawing>
-        </mc:Choice>
-        <mc:Fallback>
-          <w:pict>
-            <v:line w14:anchorId="0705C752" id="Conector reto 54" o:spid="_x0000_s1026" style="position:absolute;flip:x;z-index:251664384;visibility:visible;mso-wrap-style:square;mso-wrap-distance-left:9pt;mso-wrap-distance-top:0;mso-wrap-distance-right:9pt;mso-wrap-distance-bottom:0;mso-position-horizontal:absolute;mso-position-horizontal-relative:text;mso-position-vertical:absolute;mso-position-vertical-relative:text" from="286.9pt,8.55pt" to="286.9pt,46.55pt" o:gfxdata="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" strokecolor="black [3213]" strokeweight=".5pt">
-              <v:stroke joinstyle="miter"/>
-            </v:line>
-          </w:pict>
-        </mc:Fallback>
-      </mc:AlternateContent>
-    </w:r>
-    <w:r>
-      <w:rPr>
-        <w:noProof/>
-      </w:rPr>
-      <mc:AlternateContent>
-        <mc:Choice Requires="wps">
-          <w:drawing>
-            <wp:anchor distT="0" distB="0" distL="114300" distR="114300" simplePos="0" relativeHeight="251662336" behindDoc="0" locked="0" layoutInCell="1" allowOverlap="1" wp14:anchorId="383D46B9" wp14:editId="63459F1F">
-              <wp:simplePos x="0" y="0"/>
-              <wp:positionH relativeFrom="column">
-                <wp:posOffset>1879600</wp:posOffset>
-              </wp:positionH>
-              <wp:positionV relativeFrom="paragraph">
-                <wp:posOffset>112065</wp:posOffset>
-              </wp:positionV>
-              <wp:extent cx="0" cy="482600"/>
-              <wp:effectExtent l="0" t="0" r="38100" b="31750"/>
-              <wp:wrapNone/>
-              <wp:docPr id="108" name="Conector reto 108"/>
-              <wp:cNvGraphicFramePr/>
-              <a:graphic xmlns:a="http://schemas.openxmlformats.org/drawingml/2006/main">
-                <a:graphicData uri="http://schemas.microsoft.com/office/word/2010/wordprocessingShape">
-                  <wps:wsp>
-                    <wps:cNvCnPr/>
-                    <wps:spPr>
-                      <a:xfrm flipH="1">
-                        <a:off x="0" y="0"/>
-                        <a:ext cx="0" cy="482600"/>
-                      </a:xfrm>
-                      <a:prstGeom prst="line">
-                        <a:avLst/>
-                      </a:prstGeom>
-                      <a:ln>
-                        <a:solidFill>
-                          <a:schemeClr val="tx1"/>
-                        </a:solidFill>
-                      </a:ln>
-                    </wps:spPr>
-                    <wps:style>
-                      <a:lnRef idx="1">
-                        <a:schemeClr val="accent6"/>
-                      </a:lnRef>
-                      <a:fillRef idx="0">
-                        <a:schemeClr val="accent6"/>
-                      </a:fillRef>
-                      <a:effectRef idx="0">
-                        <a:schemeClr val="accent6"/>
-                      </a:effectRef>
-                      <a:fontRef idx="minor">
-                        <a:schemeClr val="tx1"/>
-                      </a:fontRef>
-                    </wps:style>
-                    <wps:bodyPr/>
-                  </wps:wsp>
-                </a:graphicData>
-              </a:graphic>
-            </wp:anchor>
-          </w:drawing>
-        </mc:Choice>
-        <mc:Fallback>
-          <w:pict>
-            <v:line w14:anchorId="338484C9" id="Conector reto 108" o:spid="_x0000_s1026" style="position:absolute;flip:x;z-index:251662336;visibility:visible;mso-wrap-style:square;mso-wrap-distance-left:9pt;mso-wrap-distance-top:0;mso-wrap-distance-right:9pt;mso-wrap-distance-bottom:0;mso-position-horizontal:absolute;mso-position-horizontal-relative:text;mso-position-vertical:absolute;mso-position-vertical-relative:text" from="148pt,8.8pt" to="148pt,46.8pt" o:gfxdata="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" strokecolor="black [3213]" strokeweight=".5pt">
-              <v:stroke joinstyle="miter"/>
-            </v:line>
-          </w:pict>
-        </mc:Fallback>
-      </mc:AlternateContent>
-    </w:r>
-    <w:r>
-      <w:rPr>
-        <w:noProof/>
-      </w:rPr>
-      <mc:AlternateContent>
-        <mc:Choice Requires="wps">
-          <w:drawing>
-            <wp:anchor distT="0" distB="0" distL="114300" distR="114300" simplePos="0" relativeHeight="251659264" behindDoc="1" locked="0" layoutInCell="1" allowOverlap="1" wp14:anchorId="61DB4231" wp14:editId="00F65630">
-              <wp:simplePos x="0" y="0"/>
-              <wp:positionH relativeFrom="page">
-                <wp:posOffset>-482600</wp:posOffset>
-              </wp:positionH>
-              <wp:positionV relativeFrom="paragraph">
-                <wp:posOffset>-47081</wp:posOffset>
-              </wp:positionV>
-              <wp:extent cx="8356600" cy="1059180"/>
-              <wp:effectExtent l="0" t="0" r="6350" b="7620"/>
-              <wp:wrapNone/>
-              <wp:docPr id="39" name="Retângulo 39"/>
-              <wp:cNvGraphicFramePr/>
-              <a:graphic xmlns:a="http://schemas.openxmlformats.org/drawingml/2006/main">
-                <a:graphicData uri="http://schemas.microsoft.com/office/word/2010/wordprocessingShape">
-                  <wps:wsp>
-                    <wps:cNvSpPr/>
-                    <wps:spPr>
-                      <a:xfrm flipV="1">
-                        <a:off x="0" y="0"/>
-                        <a:ext cx="8356600" cy="1059180"/>
-                      </a:xfrm>
-                      <a:prstGeom prst="rect">
-                        <a:avLst/>
-                      </a:prstGeom>
-                      <a:solidFill>
-                        <a:srgbClr val="EAECF1">
-                          <a:alpha val="29804"/>
-                        </a:srgbClr>
-                      </a:solidFill>
-                      <a:ln>
-                        <a:noFill/>
-                      </a:ln>
-                    </wps:spPr>
-                    <wps:style>
-                      <a:lnRef idx="1">
-                        <a:schemeClr val="accent6"/>
-                      </a:lnRef>
-                      <a:fillRef idx="2">
-                        <a:schemeClr val="accent6"/>
-                      </a:fillRef>
-                      <a:effectRef idx="1">
-                        <a:schemeClr val="accent6"/>
-                      </a:effectRef>
-                      <a:fontRef idx="minor">
-                        <a:schemeClr val="dk1"/>
-                      </a:fontRef>
-                    </wps:style>
-                    <wps:bodyPr rot="0" spcFirstLastPara="0" vertOverflow="overflow" horzOverflow="overflow" vert="horz" wrap="square" lIns="91440" tIns="45720" rIns="91440" bIns="45720" numCol="1" spcCol="0" rtlCol="0" fromWordArt="0" anchor="ctr" anchorCtr="0" forceAA="0" compatLnSpc="1">
-                      <a:prstTxWarp prst="textNoShape">
-                        <a:avLst/>
-                      </a:prstTxWarp>
-                      <a:noAutofit/>
-                    </wps:bodyPr>
-                  </wps:wsp>
-                </a:graphicData>
-              </a:graphic>
-              <wp14:sizeRelH relativeFrom="margin">
-                <wp14:pctWidth>0</wp14:pctWidth>
-              </wp14:sizeRelH>
-              <wp14:sizeRelV relativeFrom="margin">
-                <wp14:pctHeight>0</wp14:pctHeight>
-              </wp14:sizeRelV>
-            </wp:anchor>
-          </w:drawing>
-        </mc:Choice>
-        <mc:Fallback>
-          <w:pict>
-            <v:rect w14:anchorId="6D006DA6" id="Retângulo 39" o:spid="_x0000_s1026" style="position:absolute;margin-left:-38pt;margin-top:-3.7pt;width:658pt;height:83.4pt;flip:y;z-index:-251657216;visibility:visible;mso-wrap-style:square;mso-width-percent:0;mso-height-percent:0;mso-wrap-distance-left:9pt;mso-wrap-distance-top:0;mso-wrap-distance-right:9pt;mso-wrap-distance-bottom:0;mso-position-horizontal:absolute;mso-position-horizontal-relative:page;mso-position-vertical:absolute;mso-position-vertical-relative:text;mso-width-percent:0;mso-height-percent:0;mso-width-relative:margin;mso-height-relative:margin;v-text-anchor:middle" o:gfxdata="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" fillcolor="#eaecf1" stroked="f" strokeweight=".5pt">
-              <v:fill opacity="19532f"/>
-              <w10:wrap anchorx="page"/>
-            </v:rect>
-          </w:pict>
-        </mc:Fallback>
-      </mc:AlternateContent>
-    </w:r>
-    <w:r>
-      <w:rPr>
-        <w:noProof/>
-      </w:rPr>
-      <mc:AlternateContent>
-        <mc:Choice Requires="wps">
-          <w:drawing>
-            <wp:anchor distT="0" distB="0" distL="114300" distR="114300" simplePos="0" relativeHeight="251665408" behindDoc="0" locked="0" layoutInCell="1" allowOverlap="1" wp14:anchorId="03289B15" wp14:editId="05550E76">
-              <wp:simplePos x="0" y="0"/>
-              <wp:positionH relativeFrom="page">
-                <wp:posOffset>7264400</wp:posOffset>
-              </wp:positionH>
-              <wp:positionV relativeFrom="paragraph">
-                <wp:posOffset>-46355</wp:posOffset>
-              </wp:positionV>
-              <wp:extent cx="495300" cy="1059180"/>
-              <wp:effectExtent l="0" t="0" r="0" b="7620"/>
-              <wp:wrapNone/>
-              <wp:docPr id="55" name="Retângulo 55"/>
-              <wp:cNvGraphicFramePr/>
-              <a:graphic xmlns:a="http://schemas.openxmlformats.org/drawingml/2006/main">
-                <a:graphicData uri="http://schemas.microsoft.com/office/word/2010/wordprocessingShape">
-                  <wps:wsp>
-                    <wps:cNvSpPr/>
-                    <wps:spPr>
-                      <a:xfrm flipH="1" flipV="1">
-                        <a:off x="0" y="0"/>
-                        <a:ext cx="495300" cy="1059180"/>
-                      </a:xfrm>
-                      <a:prstGeom prst="rect">
-                        <a:avLst/>
-                      </a:prstGeom>
-                      <a:solidFill>
-                        <a:srgbClr val="5A80A1"/>
-                      </a:solidFill>
-                      <a:ln>
-                        <a:noFill/>
-                      </a:ln>
-                    </wps:spPr>
-                    <wps:style>
-                      <a:lnRef idx="1">
-                        <a:schemeClr val="accent6"/>
-                      </a:lnRef>
-                      <a:fillRef idx="2">
-                        <a:schemeClr val="accent6"/>
-                      </a:fillRef>
-                      <a:effectRef idx="1">
-                        <a:schemeClr val="accent6"/>
-                      </a:effectRef>
-                      <a:fontRef idx="minor">
-                        <a:schemeClr val="dk1"/>
-                      </a:fontRef>
-                    </wps:style>
-                    <wps:bodyPr rot="0" spcFirstLastPara="0" vertOverflow="overflow" horzOverflow="overflow" vert="horz" wrap="square" lIns="91440" tIns="45720" rIns="91440" bIns="45720" numCol="1" spcCol="0" rtlCol="0" fromWordArt="0" anchor="ctr" anchorCtr="0" forceAA="0" compatLnSpc="1">
-                      <a:prstTxWarp prst="textNoShape">
-                        <a:avLst/>
-                      </a:prstTxWarp>
-                      <a:noAutofit/>
-                    </wps:bodyPr>
-                  </wps:wsp>
-                </a:graphicData>
-              </a:graphic>
-              <wp14:sizeRelH relativeFrom="margin">
-                <wp14:pctWidth>0</wp14:pctWidth>
-              </wp14:sizeRelH>
-              <wp14:sizeRelV relativeFrom="margin">
-                <wp14:pctHeight>0</wp14:pctHeight>
-              </wp14:sizeRelV>
-            </wp:anchor>
-          </w:drawing>
-        </mc:Choice>
-        <mc:Fallback>
-          <w:pict>
-            <v:rect w14:anchorId="3D14E299" id="Retângulo 55" o:spid="_x0000_s1026" style="position:absolute;margin-left:572pt;margin-top:-3.65pt;width:39pt;height:83.4pt;flip:x y;z-index:251665408;visibility:visible;mso-wrap-style:square;mso-width-percent:0;mso-height-percent:0;mso-wrap-distance-left:9pt;mso-wrap-distance-top:0;mso-wrap-distance-right:9pt;mso-wrap-distance-bottom:0;mso-position-horizontal:absolute;mso-position-horizontal-relative:page;mso-position-vertical:absolute;mso-position-vertical-relative:text;mso-width-percent:0;mso-height-percent:0;mso-width-relative:margin;mso-height-relative:margin;v-text-anchor:middle" o:gfxdata="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" fillcolor="#5a80a1" stroked="f" strokeweight=".5pt">
-              <w10:wrap anchorx="page"/>
-            </v:rect>
-          </w:pict>
-        </mc:Fallback>
-      </mc:AlternateContent>
-    </w:r>
-  </w:p>
-  <w:p>
-    <w:pPr>
-      <w:pStyle w:val="Rodap"/>
     </w:pPr>
   </w:p>
 </w:ftr>

</xml_diff>